<commit_message>
rename(P2): PLI_M06 loop rieng ds_thanh_vien_tnhh + sync post-census
Root cause: export conflict guard (LOCKED v1) dung chuan flag ds_thanh_vien
2 contract khac nhau (M06 11 cot vs M09 10 cot) — dung thiet ke. Theo tien le
nganh_sua_doi_chi_tiet: M06 dung TEN LOOP RIENG trung semantic_key manifest;
GRID_META +ds_thanh_vien_tnhh 11 cot (global, string-call coverage gate di qua);
ds_thanh_vien 10 cot giu nguyen cho M09/cac mau khac. Draft M06 rong thuc te
(section moi co meta) — chinh sach D2.9.

Sync post-census: pin [EVD]/[DELTA]/manifest-status 6 section P2A ->
already_complete; N8c baseline doi M06 -> PLII_M01 (M06 roi baseline 6eaf4ee
hop le); D7.3 M06 store key moi; form_grid_meta check 10 same-ref loop moi.

Co-Authored-By: Claude <noreply@anthropic.com>
</commit_message>
<xml_diff>
--- a/app/templates/PLI_M06.docx
+++ b/app/templates/PLI_M06.docx
@@ -500,7 +500,7 @@
           </w:tcPr>
           <w:p>
             <w:r>
-              <w:t>{#ds_thanh_vien}{_stt}</w:t>
+              <w:t>{#ds_thanh_vien_tnhh}{_stt}</w:t>
             </w:r>
           </w:p>
         </w:tc>
@@ -610,7 +610,7 @@
           </w:tcPr>
           <w:p>
             <w:r>
-              <w:t>{chu_ky}{/ds_thanh_vien}</w:t>
+              <w:t>{chu_ky}{/ds_thanh_vien_tnhh}</w:t>
             </w:r>
           </w:p>
         </w:tc>

</xml_diff>